<commit_message>
docs: Ponto 12 aplicado em produção (organização interna do código)
Co-Authored-By: Claude Opus 5.5 <noreply@anthropic.com>
</commit_message>
<xml_diff>
--- a/docs/modulos/10. Qualidade_Reclamacoes.docx
+++ b/docs/modulos/10. Qualidade_Reclamacoes.docx
@@ -927,6 +927,87 @@
           <w:szCs w:val="18"/>
         </w:rPr>
         <w:t xml:space="preserve">Indicadores: os totais gerais (Total, % fechadas, SLA) incluem as internas; as Estatísticas Fornecedores não as incluem; Dashboard → Internas mostra só as internas.</w:t>
+      </w:r>
+    </w:p>
+    <w:p>
+      <w:pPr>
+        <w:spacing w:after="40" w:before="160"/>
+        <w:keepNext/>
+      </w:pPr>
+      <w:r>
+        <w:rPr>
+          <w:b/>
+          <w:bCs/>
+          <w:color w:val="1B7F3C"/>
+        </w:rPr>
+        <w:t xml:space="preserve">Organização interna do código (31/10/2026)</w:t>
+      </w:r>
+    </w:p>
+    <w:p>
+      <w:pPr>
+        <w:spacing w:after="40"/>
+      </w:pPr>
+      <w:r>
+        <w:rPr>
+          <w:color w:val="333333"/>
+          <w:sz w:val="18"/>
+          <w:szCs w:val="18"/>
+        </w:rPr>
+        <w:t xml:space="preserve">Versão 18.0.1.2.0: o código foi reorganizado para eliminar repetições, sem mudar o que o utilizador vê ou faz. Não houve nenhuma alteração no funcionamento: formulários, respostas, menus, PDFs, emails, painéis, permissões e dados ficaram exactamente iguais (verificado antes e depois, numa cópia e em produção).</w:t>
+      </w:r>
+    </w:p>
+    <w:p>
+      <w:pPr>
+        <w:pStyle w:val="ListParagraph"/>
+        <w:numPr>
+          <w:ilvl w:val="0"/>
+          <w:numId w:val="2"/>
+        </w:numPr>
+        <w:spacing w:after="20"/>
+      </w:pPr>
+      <w:r>
+        <w:rPr>
+          <w:color w:val="333333"/>
+          <w:sz w:val="18"/>
+          <w:szCs w:val="18"/>
+        </w:rPr>
+        <w:t xml:space="preserve">As listas de Estado, Categoria, Origem e Gravidade passaram a estar num só sítio (models/constantes.py), usado pelas respostas, pelas listas e pelos painéis.</w:t>
+      </w:r>
+    </w:p>
+    <w:p>
+      <w:pPr>
+        <w:pStyle w:val="ListParagraph"/>
+        <w:numPr>
+          <w:ilvl w:val="0"/>
+          <w:numId w:val="2"/>
+        </w:numPr>
+        <w:spacing w:after="20"/>
+      </w:pPr>
+      <w:r>
+        <w:rPr>
+          <w:color w:val="333333"/>
+          <w:sz w:val="18"/>
+          <w:szCs w:val="18"/>
+        </w:rPr>
+        <w:t xml:space="preserve">As respostas de clientes e de fornecedores partilham uma base comum (models/resposta_base.py); a "última resposta" e o botão Responder estão escritos uma só vez.</w:t>
+      </w:r>
+    </w:p>
+    <w:p>
+      <w:pPr>
+        <w:pStyle w:val="ListParagraph"/>
+        <w:numPr>
+          <w:ilvl w:val="0"/>
+          <w:numId w:val="2"/>
+        </w:numPr>
+        <w:spacing w:after="20"/>
+      </w:pPr>
+      <w:r>
+        <w:rPr>
+          <w:color w:val="333333"/>
+          <w:sz w:val="18"/>
+          <w:szCs w:val="18"/>
+        </w:rPr>
+        <w:t xml:space="preserve">O SQL do Dashboard é gerado a partir de um único modelo, aplicado a clientes e a fornecedores. As bases comuns não têm tabela própria nem guardam dados.</w:t>
       </w:r>
     </w:p>
     <w:p>

</xml_diff>